<commit_message>
Link the published GitHub repo from the blog post
Co-Authored-By: Claude Opus 4.8 <noreply@anthropic.com>
</commit_message>
<xml_diff>
--- a/Last30Days-Zyte-Search-Engine-blog.docx
+++ b/Last30Days-Zyte-Search-Engine-blog.docx
@@ -2,7 +2,7 @@
 <file path=word/document.xml><?xml version="1.0" encoding="utf-8"?>
 <w:document xmlns:w="http://schemas.openxmlformats.org/wordprocessingml/2006/main" xmlns:m="http://schemas.openxmlformats.org/officeDocument/2006/math" xmlns:r="http://schemas.openxmlformats.org/officeDocument/2006/relationships" xmlns:o="urn:schemas-microsoft-com:office:office" xmlns:v="urn:schemas-microsoft-com:vml" xmlns:w10="urn:schemas-microsoft-com:office:word" xmlns:a="http://schemas.openxmlformats.org/drawingml/2006/main" xmlns:pic="http://schemas.openxmlformats.org/drawingml/2006/picture" xmlns:wp="http://schemas.openxmlformats.org/drawingml/2006/wordprocessingDrawing">
   <w:body>
-    <w:bookmarkStart w:id="27" w:name="Xa44759b8adb4f45d520755cfdc3d514e0fea09d"/>
+    <w:bookmarkStart w:id="28" w:name="Xa44759b8adb4f45d520755cfdc3d514e0fea09d"/>
     <w:p>
       <w:pPr>
         <w:pStyle w:val="Heading1"/>
@@ -24,12 +24,29 @@
         <w:pStyle w:val="BodyText"/>
       </w:pPr>
       <w:r>
-        <w:t xml:space="preserve">The interesting part is that almost all of that pain is a web-data problem, not a reasoning problem. The reasoning is easy once the evidence is in front of you in a clean, attributed, deduplicated form. Getting fresh search results reliably, at the moment you ask, across a topic you did not anticipate yesterday, is the hard part, and it is exactly the part a search API is built to solve. This post walks through a small open-source engine that turns "research the last 30 days of X" into a repeatable, evidence-backed pipeline for any X, with the</w:t>
+        <w:t xml:space="preserve">The interesting part is that almost all of that pain is a web-data problem, not a reasoning problem. The reasoning is easy once the evidence is in front of you in a clean, attributed, deduplicated form. Getting fresh search results reliably, at the moment you ask, across a topic you did not anticipate yesterday, is the hard part, and it is exactly the part a search API is built to solve. This post walks through a</w:t>
       </w:r>
       <w:r>
         <w:t xml:space="preserve"> </w:t>
       </w:r>
       <w:hyperlink r:id="rId9">
+        <w:r>
+          <w:rPr>
+            <w:rStyle w:val="Hyperlink"/>
+          </w:rPr>
+          <w:t xml:space="preserve">small open-source engine</w:t>
+        </w:r>
+      </w:hyperlink>
+      <w:r>
+        <w:t xml:space="preserve"> </w:t>
+      </w:r>
+      <w:r>
+        <w:t xml:space="preserve">that turns "research the last 30 days of X" into a repeatable, evidence-backed pipeline for any X, with the</w:t>
+      </w:r>
+      <w:r>
+        <w:t xml:space="preserve"> </w:t>
+      </w:r>
+      <w:hyperlink r:id="rId10">
         <w:r>
           <w:rPr>
             <w:rStyle w:val="Hyperlink"/>
@@ -56,7 +73,7 @@
         <w:t xml:space="preserve">[Image placeholder (hero) — Alt text: A search API node feeding a four-stage research pipeline from discovery to report. Generation prompt: A clean, modern isometric illustration on a 135-degree hero gradient background flowing from deep indigo #1a0a3d through magenta-purple #5a1480 to bright magenta #9b1a8a. The scene shows a single glowing search-API node on the left feeding a horizontal pipeline of four connected glass panels labeled with simple icons: a magnifier (discovery), a funnel (normalization), a grid (taxonomy), and a document (report). Thin white connecting lines with small data particles flow left to right. Professional, developer-focused, slightly editorial, no text labels rendered as words.]</w:t>
       </w:r>
     </w:p>
-    <w:bookmarkStart w:id="12" w:name="why-a-search-api-is-the-turbo-boost"/>
+    <w:bookmarkStart w:id="13" w:name="why-a-search-api-is-the-turbo-boost"/>
     <w:p>
       <w:pPr>
         <w:pStyle w:val="Heading2"/>
@@ -75,7 +92,7 @@
       <w:r>
         <w:t xml:space="preserve"> </w:t>
       </w:r>
-      <w:hyperlink r:id="rId10">
+      <w:hyperlink r:id="rId11">
         <w:r>
           <w:rPr>
             <w:rStyle w:val="Hyperlink"/>
@@ -97,7 +114,7 @@
       <w:r>
         <w:t xml:space="preserve"> </w:t>
       </w:r>
-      <w:hyperlink r:id="rId11">
+      <w:hyperlink r:id="rId12">
         <w:r>
           <w:rPr>
             <w:rStyle w:val="Hyperlink"/>
@@ -117,8 +134,8 @@
         <w:t xml:space="preserve">The engine below is stdlib-only Python with one external dependency that matters, the search API, and it ships with a deterministic mock mode so you can run the whole thing end to end before you ever touch a key.</w:t>
       </w:r>
     </w:p>
-    <w:bookmarkEnd w:id="12"/>
-    <w:bookmarkStart w:id="15" w:name="X81e8cc2bee264e4d1f25f4f0e364a8e7d124f34"/>
+    <w:bookmarkEnd w:id="13"/>
+    <w:bookmarkStart w:id="16" w:name="X81e8cc2bee264e4d1f25f4f0e364a8e7d124f34"/>
     <w:p>
       <w:pPr>
         <w:pStyle w:val="Heading2"/>
@@ -137,7 +154,7 @@
       <w:r>
         <w:t xml:space="preserve"> </w:t>
       </w:r>
-      <w:hyperlink r:id="rId9">
+      <w:hyperlink r:id="rId10">
         <w:r>
           <w:rPr>
             <w:rStyle w:val="Hyperlink"/>
@@ -162,7 +179,7 @@
       <w:r>
         <w:t xml:space="preserve"> </w:t>
       </w:r>
-      <w:hyperlink r:id="rId13">
+      <w:hyperlink r:id="rId14">
         <w:r>
           <w:rPr>
             <w:rStyle w:val="Hyperlink"/>
@@ -200,7 +217,7 @@
       <w:r>
         <w:t xml:space="preserve"> </w:t>
       </w:r>
-      <w:hyperlink r:id="rId14">
+      <w:hyperlink r:id="rId15">
         <w:r>
           <w:rPr>
             <w:rStyle w:val="Hyperlink"/>
@@ -258,8 +275,8 @@
         <w:t xml:space="preserve">Put together, these turn search from a thing you maintain into a thing you call, and that shift is what lets the rest of the engine stay small.</w:t>
       </w:r>
     </w:p>
-    <w:bookmarkEnd w:id="15"/>
-    <w:bookmarkStart w:id="16" w:name="from-a-topic-to-a-query-pack"/>
+    <w:bookmarkEnd w:id="16"/>
+    <w:bookmarkStart w:id="17" w:name="from-a-topic-to-a-query-pack"/>
     <w:p>
       <w:pPr>
         <w:pStyle w:val="Heading2"/>
@@ -541,8 +558,8 @@
         <w:t xml:space="preserve">The ordering is deliberate. The bare topic and its recency variants carry the freshest signal, so they come first, which means that capping the pack for a cheap spike still keeps the highest-value queries. Nothing here is specific to any subject: the only domain knowledge in the entire engine is what you pass on the command line.</w:t>
       </w:r>
     </w:p>
-    <w:bookmarkEnd w:id="16"/>
-    <w:bookmarkStart w:id="18" w:name="X4a9635a1bb19d88bc689ffd1eaef8ef82029065"/>
+    <w:bookmarkEnd w:id="17"/>
+    <w:bookmarkStart w:id="19" w:name="X4a9635a1bb19d88bc689ffd1eaef8ef82029065"/>
     <w:p>
       <w:pPr>
         <w:pStyle w:val="Heading2"/>
@@ -561,7 +578,7 @@
       <w:r>
         <w:t xml:space="preserve"> </w:t>
       </w:r>
-      <w:hyperlink r:id="rId17">
+      <w:hyperlink r:id="rId18">
         <w:r>
           <w:rPr>
             <w:rStyle w:val="Hyperlink"/>
@@ -1196,8 +1213,8 @@
         <w:t xml:space="preserve">search through the same Zyte API search call rather than fighting Reddit's bot bans directly. Both return results in the same shape as the main search, so they flow through the rest of the pipeline unchanged.</w:t>
       </w:r>
     </w:p>
-    <w:bookmarkEnd w:id="18"/>
-    <w:bookmarkStart w:id="19" w:name="turning-results-into-evidence-not-a-blob"/>
+    <w:bookmarkEnd w:id="19"/>
+    <w:bookmarkStart w:id="20" w:name="turning-results-into-evidence-not-a-blob"/>
     <w:p>
       <w:pPr>
         <w:pStyle w:val="Heading2"/>
@@ -1712,7 +1729,7 @@
       <w:r>
         <w:t xml:space="preserve"> </w:t>
       </w:r>
-      <w:hyperlink r:id="rId14">
+      <w:hyperlink r:id="rId15">
         <w:r>
           <w:rPr>
             <w:rStyle w:val="Hyperlink"/>
@@ -1727,8 +1744,8 @@
         <w:t xml:space="preserve">capability applied to a research context rather than a commerce one.</w:t>
       </w:r>
     </w:p>
-    <w:bookmarkEnd w:id="19"/>
-    <w:bookmarkStart w:id="20" w:name="X3e7340f1a1b0a4e917fd943fb974feab00b9bf8"/>
+    <w:bookmarkEnd w:id="20"/>
+    <w:bookmarkStart w:id="21" w:name="X3e7340f1a1b0a4e917fd943fb974feab00b9bf8"/>
     <w:p>
       <w:pPr>
         <w:pStyle w:val="Heading2"/>
@@ -1765,8 +1782,8 @@
         <w:t xml:space="preserve">Because the brief is plain markdown with stable evidence IDs, it is just as readable to a person skimming it as it is to a model summarizing it. That dual-audience property is the quiet payoff of doing the structuring work up front instead of asking an LLM to improvise a summary from raw HTML.</w:t>
       </w:r>
     </w:p>
-    <w:bookmarkEnd w:id="20"/>
-    <w:bookmarkStart w:id="22" w:name="watching-what-changes"/>
+    <w:bookmarkEnd w:id="21"/>
+    <w:bookmarkStart w:id="23" w:name="watching-what-changes"/>
     <w:p>
       <w:pPr>
         <w:pStyle w:val="Heading2"/>
@@ -1785,7 +1802,7 @@
       <w:r>
         <w:t xml:space="preserve"> </w:t>
       </w:r>
-      <w:hyperlink r:id="rId21">
+      <w:hyperlink r:id="rId22">
         <w:r>
           <w:rPr>
             <w:rStyle w:val="Hyperlink"/>
@@ -1797,8 +1814,8 @@
         <w:t xml:space="preserve">, where the value compounds because the system remembers what it saw last time.</w:t>
       </w:r>
     </w:p>
-    <w:bookmarkEnd w:id="22"/>
-    <w:bookmarkStart w:id="24" w:name="hand-it-to-an-agent"/>
+    <w:bookmarkEnd w:id="23"/>
+    <w:bookmarkStart w:id="25" w:name="hand-it-to-an-agent"/>
     <w:p>
       <w:pPr>
         <w:pStyle w:val="Heading2"/>
@@ -2151,7 +2168,7 @@
       <w:r>
         <w:t xml:space="preserve"> </w:t>
       </w:r>
-      <w:hyperlink r:id="rId23">
+      <w:hyperlink r:id="rId24">
         <w:r>
           <w:rPr>
             <w:rStyle w:val="Hyperlink"/>
@@ -2166,8 +2183,8 @@
         <w:t xml:space="preserve">covers the same approach applied to general web data, and the engine here is essentially that idea pointed at research instead of extraction.</w:t>
       </w:r>
     </w:p>
-    <w:bookmarkEnd w:id="24"/>
-    <w:bookmarkStart w:id="26" w:name="try-it-yourself"/>
+    <w:bookmarkEnd w:id="25"/>
+    <w:bookmarkStart w:id="27" w:name="try-it-yourself"/>
     <w:p>
       <w:pPr>
         <w:pStyle w:val="Heading2"/>
@@ -2188,13 +2205,21 @@
       <w:pPr>
         <w:pStyle w:val="BodyText"/>
       </w:pPr>
-      <w:r>
-        <w:t xml:space="preserve">Clone the engine, run it in mock mode to see the full brief in under a minute, then drop in a</w:t>
-      </w:r>
-      <w:r>
-        <w:t xml:space="preserve"> </w:t>
-      </w:r>
-      <w:hyperlink r:id="rId17">
+      <w:hyperlink r:id="rId9">
+        <w:r>
+          <w:rPr>
+            <w:rStyle w:val="Hyperlink"/>
+          </w:rPr>
+          <w:t xml:space="preserve">Clone the engine</w:t>
+        </w:r>
+      </w:hyperlink>
+      <w:r>
+        <w:t xml:space="preserve">, run it in mock mode to see the full brief in under a minute, then drop in a</w:t>
+      </w:r>
+      <w:r>
+        <w:t xml:space="preserve"> </w:t>
+      </w:r>
+      <w:hyperlink r:id="rId18">
         <w:r>
           <w:rPr>
             <w:rStyle w:val="Hyperlink"/>
@@ -2211,7 +2236,7 @@
       <w:r>
         <w:t xml:space="preserve"> </w:t>
       </w:r>
-      <w:hyperlink r:id="rId25">
+      <w:hyperlink r:id="rId26">
         <w:r>
           <w:rPr>
             <w:rStyle w:val="Hyperlink"/>
@@ -2226,8 +2251,8 @@
         <w:t xml:space="preserve">to go further with the search and extraction capabilities, and from there the only limit on what you can put under standing, evidence-backed observation is the list of topics you can think of.</w:t>
       </w:r>
     </w:p>
-    <w:bookmarkEnd w:id="26"/>
     <w:bookmarkEnd w:id="27"/>
+    <w:bookmarkEnd w:id="28"/>
     <w:sectPr>
       <w:footnotePr>
         <w:numRestart w:val="eachSect"/>

</xml_diff>

<commit_message>
Blog: embed architecture diagram and add a real (live) run example
Add the pipeline diagram as a figure, and a "What a real run looks like"
section grounded in the live AI-coding-agents run (69 evidence items, real
sources). Regenerate the .docx with the diagram embedded as a raster image.

Co-Authored-By: Claude Opus 4.8 <noreply@anthropic.com>
</commit_message>
<xml_diff>
--- a/Last30Days-Zyte-Search-Engine-blog.docx
+++ b/Last30Days-Zyte-Search-Engine-blog.docx
@@ -2,7 +2,7 @@
 <file path=word/document.xml><?xml version="1.0" encoding="utf-8"?>
 <w:document xmlns:w="http://schemas.openxmlformats.org/wordprocessingml/2006/main" xmlns:m="http://schemas.openxmlformats.org/officeDocument/2006/math" xmlns:r="http://schemas.openxmlformats.org/officeDocument/2006/relationships" xmlns:o="urn:schemas-microsoft-com:office:office" xmlns:v="urn:schemas-microsoft-com:vml" xmlns:w10="urn:schemas-microsoft-com:office:word" xmlns:a="http://schemas.openxmlformats.org/drawingml/2006/main" xmlns:pic="http://schemas.openxmlformats.org/drawingml/2006/picture" xmlns:wp="http://schemas.openxmlformats.org/drawingml/2006/wordprocessingDrawing">
   <w:body>
-    <w:bookmarkStart w:id="28" w:name="Xa44759b8adb4f45d520755cfdc3d514e0fea09d"/>
+    <w:bookmarkStart w:id="32" w:name="Xa44759b8adb4f45d520755cfdc3d514e0fea09d"/>
     <w:p>
       <w:pPr>
         <w:pStyle w:val="Heading1"/>
@@ -73,7 +73,66 @@
         <w:t xml:space="preserve">[Image placeholder (hero) — Alt text: A search API node feeding a four-stage research pipeline from discovery to report. Generation prompt: A clean, modern isometric illustration on a 135-degree hero gradient background flowing from deep indigo #1a0a3d through magenta-purple #5a1480 to bright magenta #9b1a8a. The scene shows a single glowing search-API node on the left feeding a horizontal pipeline of four connected glass panels labeled with simple icons: a magnifier (discovery), a funnel (normalization), a grid (taxonomy), and a document (report). Thin white connecting lines with small data particles flow left to right. Professional, developer-focused, slightly editorial, no text labels rendered as words.]</w:t>
       </w:r>
     </w:p>
-    <w:bookmarkStart w:id="13" w:name="why-a-search-api-is-the-turbo-boost"/>
+    <w:p>
+      <w:pPr>
+        <w:pStyle w:val="BodyText"/>
+      </w:pPr>
+      <w:r>
+        <w:drawing>
+          <wp:inline>
+            <wp:extent cx="5334000" cy="5334000"/>
+            <wp:effectExtent b="0" l="0" r="0" t="0"/>
+            <wp:docPr descr="Last30Days Pro Max Universal pipeline: a topic plus optional angles and entities flows into the Zyte Search API for SERP discovery, then evidence normalization, then taxonomy and SQLite deltas, then an indexed report and an action list, with Hacker News and Reddit connectors and page extraction feeding in." title="" id="12" name="Picture"/>
+            <a:graphic>
+              <a:graphicData uri="http://schemas.openxmlformats.org/drawingml/2006/picture">
+                <pic:pic>
+                  <pic:nvPicPr>
+                    <pic:cNvPr descr="docs/last30days-pipeline.png" id="13" name="Picture"/>
+                    <pic:cNvPicPr>
+                      <a:picLocks noChangeArrowheads="1" noChangeAspect="1"/>
+                    </pic:cNvPicPr>
+                  </pic:nvPicPr>
+                  <pic:blipFill>
+                    <a:blip r:embed="rId11"/>
+                    <a:stretch>
+                      <a:fillRect/>
+                    </a:stretch>
+                  </pic:blipFill>
+                  <pic:spPr bwMode="auto">
+                    <a:xfrm>
+                      <a:off x="0" y="0"/>
+                      <a:ext cx="5334000" cy="5334000"/>
+                    </a:xfrm>
+                    <a:prstGeom prst="rect">
+                      <a:avLst/>
+                    </a:prstGeom>
+                    <a:noFill/>
+                    <a:ln w="9525">
+                      <a:noFill/>
+                      <a:headEnd/>
+                      <a:tailEnd/>
+                    </a:ln>
+                  </pic:spPr>
+                </pic:pic>
+              </a:graphicData>
+            </a:graphic>
+          </wp:inline>
+        </w:drawing>
+      </w:r>
+    </w:p>
+    <w:p>
+      <w:pPr>
+        <w:pStyle w:val="BodyText"/>
+      </w:pPr>
+      <w:r>
+        <w:rPr>
+          <w:i/>
+          <w:iCs/>
+        </w:rPr>
+        <w:t xml:space="preserve">The whole engine at a glance: one search API feeds discovery, and everything downstream is normalization, taxonomy, and reporting.</w:t>
+      </w:r>
+    </w:p>
+    <w:bookmarkStart w:id="16" w:name="why-a-search-api-is-the-turbo-boost"/>
     <w:p>
       <w:pPr>
         <w:pStyle w:val="Heading2"/>
@@ -92,7 +151,7 @@
       <w:r>
         <w:t xml:space="preserve"> </w:t>
       </w:r>
-      <w:hyperlink r:id="rId11">
+      <w:hyperlink r:id="rId14">
         <w:r>
           <w:rPr>
             <w:rStyle w:val="Hyperlink"/>
@@ -114,7 +173,7 @@
       <w:r>
         <w:t xml:space="preserve"> </w:t>
       </w:r>
-      <w:hyperlink r:id="rId12">
+      <w:hyperlink r:id="rId15">
         <w:r>
           <w:rPr>
             <w:rStyle w:val="Hyperlink"/>
@@ -134,8 +193,8 @@
         <w:t xml:space="preserve">The engine below is stdlib-only Python with one external dependency that matters, the search API, and it ships with a deterministic mock mode so you can run the whole thing end to end before you ever touch a key.</w:t>
       </w:r>
     </w:p>
-    <w:bookmarkEnd w:id="13"/>
-    <w:bookmarkStart w:id="16" w:name="X81e8cc2bee264e4d1f25f4f0e364a8e7d124f34"/>
+    <w:bookmarkEnd w:id="16"/>
+    <w:bookmarkStart w:id="19" w:name="X81e8cc2bee264e4d1f25f4f0e364a8e7d124f34"/>
     <w:p>
       <w:pPr>
         <w:pStyle w:val="Heading2"/>
@@ -179,7 +238,7 @@
       <w:r>
         <w:t xml:space="preserve"> </w:t>
       </w:r>
-      <w:hyperlink r:id="rId14">
+      <w:hyperlink r:id="rId17">
         <w:r>
           <w:rPr>
             <w:rStyle w:val="Hyperlink"/>
@@ -217,7 +276,7 @@
       <w:r>
         <w:t xml:space="preserve"> </w:t>
       </w:r>
-      <w:hyperlink r:id="rId15">
+      <w:hyperlink r:id="rId18">
         <w:r>
           <w:rPr>
             <w:rStyle w:val="Hyperlink"/>
@@ -275,8 +334,8 @@
         <w:t xml:space="preserve">Put together, these turn search from a thing you maintain into a thing you call, and that shift is what lets the rest of the engine stay small.</w:t>
       </w:r>
     </w:p>
-    <w:bookmarkEnd w:id="16"/>
-    <w:bookmarkStart w:id="17" w:name="from-a-topic-to-a-query-pack"/>
+    <w:bookmarkEnd w:id="19"/>
+    <w:bookmarkStart w:id="20" w:name="from-a-topic-to-a-query-pack"/>
     <w:p>
       <w:pPr>
         <w:pStyle w:val="Heading2"/>
@@ -558,8 +617,8 @@
         <w:t xml:space="preserve">The ordering is deliberate. The bare topic and its recency variants carry the freshest signal, so they come first, which means that capping the pack for a cheap spike still keeps the highest-value queries. Nothing here is specific to any subject: the only domain knowledge in the entire engine is what you pass on the command line.</w:t>
       </w:r>
     </w:p>
-    <w:bookmarkEnd w:id="17"/>
-    <w:bookmarkStart w:id="19" w:name="X4a9635a1bb19d88bc689ffd1eaef8ef82029065"/>
+    <w:bookmarkEnd w:id="20"/>
+    <w:bookmarkStart w:id="22" w:name="X4a9635a1bb19d88bc689ffd1eaef8ef82029065"/>
     <w:p>
       <w:pPr>
         <w:pStyle w:val="Heading2"/>
@@ -578,7 +637,7 @@
       <w:r>
         <w:t xml:space="preserve"> </w:t>
       </w:r>
-      <w:hyperlink r:id="rId18">
+      <w:hyperlink r:id="rId21">
         <w:r>
           <w:rPr>
             <w:rStyle w:val="Hyperlink"/>
@@ -1213,8 +1272,8 @@
         <w:t xml:space="preserve">search through the same Zyte API search call rather than fighting Reddit's bot bans directly. Both return results in the same shape as the main search, so they flow through the rest of the pipeline unchanged.</w:t>
       </w:r>
     </w:p>
-    <w:bookmarkEnd w:id="19"/>
-    <w:bookmarkStart w:id="20" w:name="turning-results-into-evidence-not-a-blob"/>
+    <w:bookmarkEnd w:id="22"/>
+    <w:bookmarkStart w:id="23" w:name="turning-results-into-evidence-not-a-blob"/>
     <w:p>
       <w:pPr>
         <w:pStyle w:val="Heading2"/>
@@ -1729,7 +1788,7 @@
       <w:r>
         <w:t xml:space="preserve"> </w:t>
       </w:r>
-      <w:hyperlink r:id="rId15">
+      <w:hyperlink r:id="rId18">
         <w:r>
           <w:rPr>
             <w:rStyle w:val="Hyperlink"/>
@@ -1744,8 +1803,8 @@
         <w:t xml:space="preserve">capability applied to a research context rather than a commerce one.</w:t>
       </w:r>
     </w:p>
-    <w:bookmarkEnd w:id="20"/>
-    <w:bookmarkStart w:id="21" w:name="X3e7340f1a1b0a4e917fd943fb974feab00b9bf8"/>
+    <w:bookmarkEnd w:id="23"/>
+    <w:bookmarkStart w:id="24" w:name="X3e7340f1a1b0a4e917fd943fb974feab00b9bf8"/>
     <w:p>
       <w:pPr>
         <w:pStyle w:val="Heading2"/>
@@ -1782,13 +1841,328 @@
         <w:t xml:space="preserve">Because the brief is plain markdown with stable evidence IDs, it is just as readable to a person skimming it as it is to a model summarizing it. That dual-audience property is the quiet payoff of doing the structuring work up front instead of asking an LLM to improvise a summary from raw HTML.</w:t>
       </w:r>
     </w:p>
-    <w:bookmarkEnd w:id="21"/>
-    <w:bookmarkStart w:id="23" w:name="watching-what-changes"/>
+    <w:bookmarkEnd w:id="24"/>
+    <w:bookmarkStart w:id="25" w:name="what-a-real-run-looks-like"/>
     <w:p>
       <w:pPr>
         <w:pStyle w:val="Heading2"/>
       </w:pPr>
       <w:r>
+        <w:t xml:space="preserve">What a real run looks like</w:t>
+      </w:r>
+    </w:p>
+    <w:p>
+      <w:pPr>
+        <w:pStyle w:val="FirstParagraph"/>
+      </w:pPr>
+      <w:r>
+        <w:t xml:space="preserve">To make this concrete, here is an actual run against the live Zyte API search capability (not mock data), on the topic</w:t>
+      </w:r>
+      <w:r>
+        <w:t xml:space="preserve"> </w:t>
+      </w:r>
+      <w:r>
+        <w:rPr>
+          <w:i/>
+          <w:iCs/>
+        </w:rPr>
+        <w:t xml:space="preserve">AI coding agents</w:t>
+      </w:r>
+      <w:r>
+        <w:t xml:space="preserve">, tracking three named tools and adding the Hacker News connector:</w:t>
+      </w:r>
+    </w:p>
+    <w:p>
+      <w:pPr>
+        <w:pStyle w:val="SourceCode"/>
+      </w:pPr>
+      <w:r>
+        <w:rPr>
+          <w:rStyle w:val="ExtensionTok"/>
+        </w:rPr>
+        <w:t xml:space="preserve">python3</w:t>
+      </w:r>
+      <w:r>
+        <w:rPr>
+          <w:rStyle w:val="NormalTok"/>
+        </w:rPr>
+        <w:t xml:space="preserve"> </w:t>
+      </w:r>
+      <w:r>
+        <w:rPr>
+          <w:rStyle w:val="AttributeTok"/>
+        </w:rPr>
+        <w:t xml:space="preserve">-m</w:t>
+      </w:r>
+      <w:r>
+        <w:rPr>
+          <w:rStyle w:val="NormalTok"/>
+        </w:rPr>
+        <w:t xml:space="preserve"> last30days_universal.cli </w:t>
+      </w:r>
+      <w:r>
+        <w:rPr>
+          <w:rStyle w:val="AttributeTok"/>
+        </w:rPr>
+        <w:t xml:space="preserve">--topic</w:t>
+      </w:r>
+      <w:r>
+        <w:rPr>
+          <w:rStyle w:val="NormalTok"/>
+        </w:rPr>
+        <w:t xml:space="preserve"> </w:t>
+      </w:r>
+      <w:r>
+        <w:rPr>
+          <w:rStyle w:val="StringTok"/>
+        </w:rPr>
+        <w:t xml:space="preserve">"AI coding agents"</w:t>
+      </w:r>
+      <w:r>
+        <w:rPr>
+          <w:rStyle w:val="NormalTok"/>
+        </w:rPr>
+        <w:t xml:space="preserve"> </w:t>
+      </w:r>
+      <w:r>
+        <w:rPr>
+          <w:rStyle w:val="DataTypeTok"/>
+        </w:rPr>
+        <w:t xml:space="preserve">\</w:t>
+      </w:r>
+      <w:r>
+        <w:br/>
+      </w:r>
+      <w:r>
+        <w:rPr>
+          <w:rStyle w:val="NormalTok"/>
+        </w:rPr>
+        <w:t xml:space="preserve">  </w:t>
+      </w:r>
+      <w:r>
+        <w:rPr>
+          <w:rStyle w:val="AttributeTok"/>
+        </w:rPr>
+        <w:t xml:space="preserve">--entities</w:t>
+      </w:r>
+      <w:r>
+        <w:rPr>
+          <w:rStyle w:val="NormalTok"/>
+        </w:rPr>
+        <w:t xml:space="preserve"> </w:t>
+      </w:r>
+      <w:r>
+        <w:rPr>
+          <w:rStyle w:val="StringTok"/>
+        </w:rPr>
+        <w:t xml:space="preserve">"Cursor,Claude Code,Copilot"</w:t>
+      </w:r>
+      <w:r>
+        <w:rPr>
+          <w:rStyle w:val="NormalTok"/>
+        </w:rPr>
+        <w:t xml:space="preserve"> </w:t>
+      </w:r>
+      <w:r>
+        <w:rPr>
+          <w:rStyle w:val="AttributeTok"/>
+        </w:rPr>
+        <w:t xml:space="preserve">--angles</w:t>
+      </w:r>
+      <w:r>
+        <w:rPr>
+          <w:rStyle w:val="NormalTok"/>
+        </w:rPr>
+        <w:t xml:space="preserve"> </w:t>
+      </w:r>
+      <w:r>
+        <w:rPr>
+          <w:rStyle w:val="StringTok"/>
+        </w:rPr>
+        <w:t xml:space="preserve">"pricing,benchmarks"</w:t>
+      </w:r>
+      <w:r>
+        <w:rPr>
+          <w:rStyle w:val="NormalTok"/>
+        </w:rPr>
+        <w:t xml:space="preserve"> </w:t>
+      </w:r>
+      <w:r>
+        <w:rPr>
+          <w:rStyle w:val="AttributeTok"/>
+        </w:rPr>
+        <w:t xml:space="preserve">--hn</w:t>
+      </w:r>
+    </w:p>
+    <w:p>
+      <w:pPr>
+        <w:pStyle w:val="FirstParagraph"/>
+      </w:pPr>
+      <w:r>
+        <w:t xml:space="preserve">One command produced an indexed brief from</w:t>
+      </w:r>
+      <w:r>
+        <w:t xml:space="preserve"> </w:t>
+      </w:r>
+      <w:r>
+        <w:rPr>
+          <w:b/>
+          <w:bCs/>
+        </w:rPr>
+        <w:t xml:space="preserve">69 evidence items</w:t>
+      </w:r>
+      <w:r>
+        <w:t xml:space="preserve">, with every entity attributed from real titles and URLs, and sources spread across blog, GitHub, Hacker News, Reddit, docs, news, and video. A few of the real results it surfaced and classified:</w:t>
+      </w:r>
+    </w:p>
+    <w:p>
+      <w:pPr>
+        <w:pStyle w:val="Compact"/>
+        <w:numPr>
+          <w:ilvl w:val="0"/>
+          <w:numId w:val="1001"/>
+        </w:numPr>
+      </w:pPr>
+      <w:r>
+        <w:rPr>
+          <w:b/>
+          <w:bCs/>
+        </w:rPr>
+        <w:t xml:space="preserve">Cursor</w:t>
+      </w:r>
+      <w:r>
+        <w:t xml:space="preserve">, comparison: "Testing AI coding agents: Cursor vs. Claude" on</w:t>
+      </w:r>
+      <w:r>
+        <w:t xml:space="preserve"> </w:t>
+      </w:r>
+      <w:r>
+        <w:rPr>
+          <w:rStyle w:val="VerbatimChar"/>
+        </w:rPr>
+        <w:t xml:space="preserve">render.com/blog/ai-coding-agents-benchmark</w:t>
+      </w:r>
+    </w:p>
+    <w:p>
+      <w:pPr>
+        <w:pStyle w:val="Compact"/>
+        <w:numPr>
+          <w:ilvl w:val="0"/>
+          <w:numId w:val="1001"/>
+        </w:numPr>
+      </w:pPr>
+      <w:r>
+        <w:rPr>
+          <w:b/>
+          <w:bCs/>
+        </w:rPr>
+        <w:t xml:space="preserve">Cursor</w:t>
+      </w:r>
+      <w:r>
+        <w:t xml:space="preserve">, comparison: "Best AI Coding Agents: Ranked and Compared" on</w:t>
+      </w:r>
+      <w:r>
+        <w:t xml:space="preserve"> </w:t>
+      </w:r>
+      <w:r>
+        <w:rPr>
+          <w:rStyle w:val="VerbatimChar"/>
+        </w:rPr>
+        <w:t xml:space="preserve">codegen.com/best-ai-coding-agents</w:t>
+      </w:r>
+    </w:p>
+    <w:p>
+      <w:pPr>
+        <w:pStyle w:val="Compact"/>
+        <w:numPr>
+          <w:ilvl w:val="0"/>
+          <w:numId w:val="1001"/>
+        </w:numPr>
+      </w:pPr>
+      <w:r>
+        <w:rPr>
+          <w:b/>
+          <w:bCs/>
+        </w:rPr>
+        <w:t xml:space="preserve">Claude Code</w:t>
+      </w:r>
+      <w:r>
+        <w:t xml:space="preserve">, leaderboard: "Best AI Coding Agents (June 2026): Scored Leaderboard" on</w:t>
+      </w:r>
+      <w:r>
+        <w:t xml:space="preserve"> </w:t>
+      </w:r>
+      <w:r>
+        <w:rPr>
+          <w:rStyle w:val="VerbatimChar"/>
+        </w:rPr>
+        <w:t xml:space="preserve">morphllm.com</w:t>
+      </w:r>
+    </w:p>
+    <w:p>
+      <w:pPr>
+        <w:pStyle w:val="Compact"/>
+        <w:numPr>
+          <w:ilvl w:val="0"/>
+          <w:numId w:val="1001"/>
+        </w:numPr>
+      </w:pPr>
+      <w:r>
+        <w:rPr>
+          <w:b/>
+          <w:bCs/>
+        </w:rPr>
+        <w:t xml:space="preserve">Claude Code</w:t>
+      </w:r>
+      <w:r>
+        <w:t xml:space="preserve">, community: "What's your take on the best AI Coding Agents?" on</w:t>
+      </w:r>
+      <w:r>
+        <w:t xml:space="preserve"> </w:t>
+      </w:r>
+      <w:r>
+        <w:rPr>
+          <w:rStyle w:val="VerbatimChar"/>
+        </w:rPr>
+        <w:t xml:space="preserve">reddit.com/r/ChatGPTCoding</w:t>
+      </w:r>
+    </w:p>
+    <w:p>
+      <w:pPr>
+        <w:pStyle w:val="Compact"/>
+        <w:numPr>
+          <w:ilvl w:val="0"/>
+          <w:numId w:val="1001"/>
+        </w:numPr>
+      </w:pPr>
+      <w:r>
+        <w:t xml:space="preserve">A developer benchmark writeup on</w:t>
+      </w:r>
+      <w:r>
+        <w:t xml:space="preserve"> </w:t>
+      </w:r>
+      <w:r>
+        <w:rPr>
+          <w:rStyle w:val="VerbatimChar"/>
+        </w:rPr>
+        <w:t xml:space="preserve">faros.ai/blog/best-ai-coding-agents-2026</w:t>
+      </w:r>
+    </w:p>
+    <w:p>
+      <w:pPr>
+        <w:pStyle w:val="FirstParagraph"/>
+      </w:pPr>
+      <w:r>
+        <w:t xml:space="preserve">Every one of those is a row in the evidence index with an ID, a source type, a signal type, and a recommended action, so nothing in the summary floats free of a source. The whole artifact pack (brief, evidence as JSONL and CSV, the exact queries, the raw payloads, run metadata) lands in one folder, ready to read or feed to another tool.</w:t>
+      </w:r>
+    </w:p>
+    <w:bookmarkEnd w:id="25"/>
+    <w:bookmarkStart w:id="27" w:name="watching-what-changes"/>
+    <w:p>
+      <w:pPr>
+        <w:pStyle w:val="Heading2"/>
+      </w:pPr>
+      <w:r>
         <w:t xml:space="preserve">Watching what changes</w:t>
       </w:r>
     </w:p>
@@ -1802,7 +2176,7 @@
       <w:r>
         <w:t xml:space="preserve"> </w:t>
       </w:r>
-      <w:hyperlink r:id="rId22">
+      <w:hyperlink r:id="rId26">
         <w:r>
           <w:rPr>
             <w:rStyle w:val="Hyperlink"/>
@@ -1814,8 +2188,8 @@
         <w:t xml:space="preserve">, where the value compounds because the system remembers what it saw last time.</w:t>
       </w:r>
     </w:p>
-    <w:bookmarkEnd w:id="23"/>
-    <w:bookmarkStart w:id="25" w:name="hand-it-to-an-agent"/>
+    <w:bookmarkEnd w:id="27"/>
+    <w:bookmarkStart w:id="29" w:name="hand-it-to-an-agent"/>
     <w:p>
       <w:pPr>
         <w:pStyle w:val="Heading2"/>
@@ -2168,7 +2542,7 @@
       <w:r>
         <w:t xml:space="preserve"> </w:t>
       </w:r>
-      <w:hyperlink r:id="rId24">
+      <w:hyperlink r:id="rId28">
         <w:r>
           <w:rPr>
             <w:rStyle w:val="Hyperlink"/>
@@ -2183,8 +2557,8 @@
         <w:t xml:space="preserve">covers the same approach applied to general web data, and the engine here is essentially that idea pointed at research instead of extraction.</w:t>
       </w:r>
     </w:p>
-    <w:bookmarkEnd w:id="25"/>
-    <w:bookmarkStart w:id="27" w:name="try-it-yourself"/>
+    <w:bookmarkEnd w:id="29"/>
+    <w:bookmarkStart w:id="31" w:name="try-it-yourself"/>
     <w:p>
       <w:pPr>
         <w:pStyle w:val="Heading2"/>
@@ -2219,7 +2593,7 @@
       <w:r>
         <w:t xml:space="preserve"> </w:t>
       </w:r>
-      <w:hyperlink r:id="rId18">
+      <w:hyperlink r:id="rId21">
         <w:r>
           <w:rPr>
             <w:rStyle w:val="Hyperlink"/>
@@ -2236,7 +2610,7 @@
       <w:r>
         <w:t xml:space="preserve"> </w:t>
       </w:r>
-      <w:hyperlink r:id="rId26">
+      <w:hyperlink r:id="rId30">
         <w:r>
           <w:rPr>
             <w:rStyle w:val="Hyperlink"/>
@@ -2251,8 +2625,8 @@
         <w:t xml:space="preserve">to go further with the search and extraction capabilities, and from there the only limit on what you can put under standing, evidence-backed observation is the list of topics you can think of.</w:t>
       </w:r>
     </w:p>
-    <w:bookmarkEnd w:id="27"/>
-    <w:bookmarkEnd w:id="28"/>
+    <w:bookmarkEnd w:id="31"/>
+    <w:bookmarkEnd w:id="32"/>
     <w:sectPr>
       <w:footnotePr>
         <w:numRestart w:val="eachSect"/>
@@ -2363,8 +2737,114 @@
       </w:pPr>
     </w:lvl>
   </w:abstractNum>
+  <w:abstractNum w:abstractNumId="991">
+    <w:nsid w:val="0000A991"/>
+    <w:multiLevelType w:val="multilevel"/>
+    <w:lvl w:ilvl="0">
+      <w:numFmt w:val="bullet"/>
+      <w:lvlText w:val=""/>
+      <w:lvlJc w:val="left"/>
+      <w:pPr>
+        <w:ind w:left="720" w:hanging="360"/>
+      </w:pPr>
+      <w:rPr>
+        <w:rFonts w:ascii="Symbol" w:hAnsi="Symbol" w:cs="Symbol" w:hint="default"/>
+      </w:rPr>
+    </w:lvl>
+    <w:lvl w:ilvl="1">
+      <w:numFmt w:val="bullet"/>
+      <w:lvlText w:val="o"/>
+      <w:lvlJc w:val="left"/>
+      <w:pPr>
+        <w:ind w:left="1440" w:hanging="360"/>
+      </w:pPr>
+      <w:rPr>
+        <w:rFonts w:ascii="Courier New" w:hAnsi="Courier New" w:cs="Courier New" w:hint="default"/>
+      </w:rPr>
+    </w:lvl>
+    <w:lvl w:ilvl="2">
+      <w:numFmt w:val="bullet"/>
+      <w:lvlText w:val=""/>
+      <w:lvlJc w:val="left"/>
+      <w:pPr>
+        <w:ind w:left="2160" w:hanging="360"/>
+      </w:pPr>
+      <w:rPr>
+        <w:rFonts w:ascii="Wingdings" w:hAnsi="Wingdings" w:cs="Wingdings" w:hint="default"/>
+      </w:rPr>
+    </w:lvl>
+    <w:lvl w:ilvl="3">
+      <w:numFmt w:val="bullet"/>
+      <w:lvlText w:val=""/>
+      <w:lvlJc w:val="left"/>
+      <w:pPr>
+        <w:ind w:left="2880" w:hanging="360"/>
+      </w:pPr>
+      <w:rPr>
+        <w:rFonts w:ascii="Symbol" w:hAnsi="Symbol" w:cs="Symbol" w:hint="default"/>
+      </w:rPr>
+    </w:lvl>
+    <w:lvl w:ilvl="4">
+      <w:numFmt w:val="bullet"/>
+      <w:lvlText w:val="o"/>
+      <w:lvlJc w:val="left"/>
+      <w:pPr>
+        <w:ind w:left="3600" w:hanging="360"/>
+      </w:pPr>
+      <w:rPr>
+        <w:rFonts w:ascii="Courier New" w:hAnsi="Courier New" w:cs="Courier New" w:hint="default"/>
+      </w:rPr>
+    </w:lvl>
+    <w:lvl w:ilvl="5">
+      <w:numFmt w:val="bullet"/>
+      <w:lvlText w:val=""/>
+      <w:lvlJc w:val="left"/>
+      <w:pPr>
+        <w:ind w:left="4320" w:hanging="360"/>
+      </w:pPr>
+      <w:rPr>
+        <w:rFonts w:ascii="Wingdings" w:hAnsi="Wingdings" w:cs="Wingdings" w:hint="default"/>
+      </w:rPr>
+    </w:lvl>
+    <w:lvl w:ilvl="6">
+      <w:numFmt w:val="bullet"/>
+      <w:lvlText w:val=""/>
+      <w:lvlJc w:val="left"/>
+      <w:pPr>
+        <w:ind w:left="5040" w:hanging="360"/>
+      </w:pPr>
+      <w:rPr>
+        <w:rFonts w:ascii="Symbol" w:hAnsi="Symbol" w:cs="Symbol" w:hint="default"/>
+      </w:rPr>
+    </w:lvl>
+    <w:lvl w:ilvl="7">
+      <w:numFmt w:val="bullet"/>
+      <w:lvlText w:val="o"/>
+      <w:lvlJc w:val="left"/>
+      <w:pPr>
+        <w:ind w:left="5760" w:hanging="360"/>
+      </w:pPr>
+      <w:rPr>
+        <w:rFonts w:ascii="Courier New" w:hAnsi="Courier New" w:cs="Courier New" w:hint="default"/>
+      </w:rPr>
+    </w:lvl>
+    <w:lvl w:ilvl="8">
+      <w:numFmt w:val="bullet"/>
+      <w:lvlText w:val=""/>
+      <w:lvlJc w:val="left"/>
+      <w:pPr>
+        <w:ind w:left="6480" w:hanging="360"/>
+      </w:pPr>
+      <w:rPr>
+        <w:rFonts w:ascii="Wingdings" w:hAnsi="Wingdings" w:cs="Wingdings" w:hint="default"/>
+      </w:rPr>
+    </w:lvl>
+  </w:abstractNum>
   <w:num w:numId="1000">
     <w:abstractNumId w:val="990"/>
+  </w:num>
+  <w:num w:numId="1001">
+    <w:abstractNumId w:val="991"/>
   </w:num>
 </w:numbering>
 </file>

</xml_diff>